<commit_message>
User guide: what to do before "Διόρθωση βιβλιογραφίας" (it can replace or remove correct sources)
Co-Authored-By: Claude Opus 5.5 <noreply@anthropic.com>
</commit_message>
<xml_diff>
--- a/Οδηγός Χρήσης - Δημιουργία Εκπαιδευτικού Υλικού.docx
+++ b/Οδηγός Χρήσης - Δημιουργία Εκπαιδευτικού Υλικού.docx
@@ -1598,7 +1598,17 @@
         <w:t xml:space="preserve">«Διόρθωση βιβλιογραφίας»</w:t>
       </w:r>
       <w:r>
-        <w:t xml:space="preserve">: με ένα κλικ, το εργαλείο διορθώνει τα παραπάνω και ξαναελέγχει.</w:t>
+        <w:t xml:space="preserve">: ζητά από το μοντέλο να αντικαταστήσει ή να αφαιρέσει </w:t>
+      </w:r>
+      <w:r>
+        <w:rPr>
+          <w:b/>
+          <w:bCs/>
+        </w:rPr>
+        <w:t xml:space="preserve">όλες</w:t>
+      </w:r>
+      <w:r>
+        <w:t xml:space="preserve"> τις σημειωμένες πηγές μαζί, και μετά ξαναελέγχει. Ελέγξτε τες πρώτα (βλ. «Προσοχή» παρακάτω).</w:t>
       </w:r>
     </w:p>
     <w:p>
@@ -1788,31 +1798,108 @@
           <w:left w:val="single" w:color="B45309" w:sz="24" w:space="8"/>
         </w:pBdr>
         <w:shd w:fill="FEF3C7" w:color="auto" w:val="clear"/>
+        <w:spacing w:before="0" w:after="100" w:line="290"/>
+        <w:ind w:left="160" w:right="160"/>
+      </w:pPr>
+      <w:r>
+        <w:t xml:space="preserve">Το </w:t>
+      </w:r>
+      <w:r>
+        <w:rPr>
+          <w:b/>
+          <w:bCs/>
+        </w:rPr>
+        <w:t xml:space="preserve">«Δεν βρέθηκε» δεν σημαίνει απαραίτητα ότι η πηγή είναι λάθος</w:t>
+      </w:r>
+      <w:r>
+        <w:t xml:space="preserve">. Βιβλία ελληνικών εμπορικών εκδοτών, εκθέσεις οργανισμών και εκδόσεις πανεπιστημίων (π.χ. MIT) συχνά δεν υπάρχουν στις διεθνείς βάσεις. Το ίδιο ισχύει για το «Δεν τεκμηριώνει το κείμενο»: ο έλεγχος βλέπει μόνο τον τίτλο και την περίληψη της πηγής, οπότε μπορεί να κάνει λάθος. Αναζητήστε την πηγή πριν πατήσετε «Διόρθωση βιβλιογραφίας»: το κουμπί αντικαθιστά ή αφαιρεί </w:t>
+      </w:r>
+      <w:r>
+        <w:rPr>
+          <w:b/>
+          <w:bCs/>
+        </w:rPr>
+        <w:t xml:space="preserve">όλες</w:t>
+      </w:r>
+      <w:r>
+        <w:t xml:space="preserve"> τις σημειωμένες πηγές μαζί, ακόμη και όσες είναι σωστές.</w:t>
+      </w:r>
+    </w:p>
+    <w:p>
+      <w:pPr>
+        <w:pBdr>
+          <w:left w:val="single" w:color="B45309" w:sz="24" w:space="8"/>
+        </w:pBdr>
+        <w:shd w:fill="FEF3C7" w:color="auto" w:val="clear"/>
+        <w:spacing w:before="0" w:after="100" w:line="290"/>
+        <w:ind w:left="160" w:right="160"/>
+      </w:pPr>
+      <w:r>
+        <w:rPr>
+          <w:b/>
+          <w:bCs/>
+        </w:rPr>
+        <w:t xml:space="preserve">Τι να κάνετε μετά τον έλεγχο:</w:t>
+      </w:r>
+    </w:p>
+    <w:p>
+      <w:pPr>
+        <w:pBdr>
+          <w:left w:val="single" w:color="B45309" w:sz="24" w:space="8"/>
+        </w:pBdr>
+        <w:shd w:fill="FEF3C7" w:color="auto" w:val="clear"/>
+        <w:spacing w:before="0" w:after="100" w:line="290"/>
+        <w:ind w:left="400" w:right="160"/>
+      </w:pPr>
+      <w:r>
+        <w:rPr>
+          <w:b/>
+          <w:bCs/>
+        </w:rPr>
+        <w:t xml:space="preserve">→ Όλες οι σημειωμένες πηγές είναι πράγματι λάθος: </w:t>
+      </w:r>
+      <w:r>
+        <w:t xml:space="preserve">πατήστε «Διόρθωση βιβλιογραφίας».</w:t>
+      </w:r>
+    </w:p>
+    <w:p>
+      <w:pPr>
+        <w:pBdr>
+          <w:left w:val="single" w:color="B45309" w:sz="24" w:space="8"/>
+        </w:pBdr>
+        <w:shd w:fill="FEF3C7" w:color="auto" w:val="clear"/>
+        <w:spacing w:before="0" w:after="100" w:line="290"/>
+        <w:ind w:left="400" w:right="160"/>
+      </w:pPr>
+      <w:r>
+        <w:rPr>
+          <w:b/>
+          <w:bCs/>
+        </w:rPr>
+        <w:t xml:space="preserve">→ Κάποιες είναι σωστές: </w:t>
+      </w:r>
+      <w:r>
+        <w:t xml:space="preserve">μην πατήσετε το κουμπί. Χρησιμοποιήστε τις «Αλλαγές» και ζητήστε αλλαγή μόνο για όσες χρειάζεται, π.χ. «Αντικατάστησε μόνο την πηγή Χ με άλλη πηγή για τον ίδιο ισχυρισμό».</w:t>
+      </w:r>
+    </w:p>
+    <w:p>
+      <w:pPr>
+        <w:pBdr>
+          <w:left w:val="single" w:color="B45309" w:sz="24" w:space="8"/>
+        </w:pBdr>
+        <w:shd w:fill="FEF3C7" w:color="auto" w:val="clear"/>
         <w:spacing w:before="0" w:after="220" w:line="290"/>
-        <w:ind w:left="160" w:right="160"/>
-      </w:pPr>
-      <w:r>
-        <w:t xml:space="preserve">Το </w:t>
-      </w:r>
-      <w:r>
-        <w:rPr>
-          <w:b/>
-          <w:bCs/>
-        </w:rPr>
-        <w:t xml:space="preserve">«Δεν βρέθηκε» δεν σημαίνει απαραίτητα ότι η πηγή είναι λάθος</w:t>
-      </w:r>
-      <w:r>
-        <w:t xml:space="preserve">. Βιβλία ελληνικών εμπορικών εκδοτών, εκθέσεις οργανισμών και εκδόσεις πανεπιστημίων (π.χ. MIT) συχνά δεν υπάρχουν στις διεθνείς βάσεις. Αναζητήστε την πηγή πριν πατήσετε «Διόρθωση βιβλιογραφίας»: το κουμπί αντικαθιστά </w:t>
-      </w:r>
-      <w:r>
-        <w:rPr>
-          <w:b/>
-          <w:bCs/>
-        </w:rPr>
-        <w:t xml:space="preserve">όλες</w:t>
-      </w:r>
-      <w:r>
-        <w:t xml:space="preserve"> τις μη επαληθευμένες πηγές μαζί, ακόμη και όσες είναι σωστές.</w:t>
+        <w:ind w:left="400" w:right="160"/>
+      </w:pPr>
+      <w:r>
+        <w:rPr>
+          <w:b/>
+          <w:bCs/>
+        </w:rPr>
+        <w:t xml:space="preserve">→ Όλες είναι σωστές: </w:t>
+      </w:r>
+      <w:r>
+        <w:t xml:space="preserve">απλώς εγκρίνετε το τμήμα.</w:t>
       </w:r>
     </w:p>
     <w:p>

</xml_diff>